<commit_message>
Host the results page on GitHub Pages
- tools/build_results_page.py also writes docs/index.html, a complete
  HTML document, and docs/.nojekyll so Pages serves docs/ as plain files
- Footer links to the report PDF and the source code
- Kit and README point to the public page and repository

Co-Authored-By: Claude Opus 5 <noreply@anthropic.com>
</commit_message>
<xml_diff>
--- a/docs/Round1_Submission_Kit.docx
+++ b/docs/Round1_Submission_Kit.docx
@@ -805,7 +805,7 @@
                 <w:i w:val="0"/>
                 <w:sz w:val="18"/>
               </w:rPr>
-              <w:t>Optional: share the published results page from its Share menu and paste its link as the prototype link (section 2.6)</w:t>
+              <w:t>Optional: paste the public results page link as the prototype link, and the code repository link if asked (section 2.6)</w:t>
             </w:r>
           </w:p>
         </w:tc>
@@ -1961,7 +1961,7 @@
           <w:b w:val="0"/>
           <w:i w:val="0"/>
         </w:rPr>
-        <w:t xml:space="preserve"> the interactive results page at https://claude.ai/artifact/MiqA2wgSu8FcHJ4e5276eZ. It shows the wait curves, the optimised day with a reason for every session, the fault re-plan and the two-machine forecast, all from the PoC on synthetic data. The page is private until shared: open its Share menu and allow anyone with the link to view it, then paste the link. To rebuild it after re-running the PoC, run </w:t>
+        <w:t xml:space="preserve"> the interactive results page at https://psraghothamrao8.github.io/RAD-SMART/, hosted on GitHub Pages and open to anyone. It shows the wait curves, the optimised day with a reason for every session, the fault re-plan and the two-machine forecast, all from the PoC on synthetic data. After re-running the PoC, run </w:t>
       </w:r>
       <w:r>
         <w:rPr>
@@ -1977,23 +1977,7 @@
           <w:b w:val="0"/>
           <w:i w:val="0"/>
         </w:rPr>
-        <w:t xml:space="preserve">, which writes </w:t>
-      </w:r>
-      <w:r>
-        <w:rPr>
-          <w:rFonts w:ascii="Consolas" w:hAnsi="Consolas"/>
-          <w:b w:val="0"/>
-          <w:i w:val="0"/>
-          <w:sz w:val="18"/>
-        </w:rPr>
-        <w:t>docs/web/rad-smart-prototype.html</w:t>
-      </w:r>
-      <w:r>
-        <w:rPr>
-          <w:b w:val="0"/>
-          <w:i w:val="0"/>
-        </w:rPr>
-        <w:t>.</w:t>
+        <w:t>, commit and push; the page updates within a few minutes.</w:t>
       </w:r>
     </w:p>
     <w:p>
@@ -2016,30 +2000,14 @@
           <w:b/>
           <w:i w:val="0"/>
         </w:rPr>
-        <w:t>Code (optional):</w:t>
+        <w:t>Code:</w:t>
       </w:r>
       <w:r>
         <w:rPr>
           <w:b w:val="0"/>
           <w:i w:val="0"/>
         </w:rPr>
-        <w:t xml:space="preserve"> a repository containing the </w:t>
-      </w:r>
-      <w:r>
-        <w:rPr>
-          <w:rFonts w:ascii="Consolas" w:hAnsi="Consolas"/>
-          <w:b w:val="0"/>
-          <w:i w:val="0"/>
-          <w:sz w:val="18"/>
-        </w:rPr>
-        <w:t>poc/</w:t>
-      </w:r>
-      <w:r>
-        <w:rPr>
-          <w:b w:val="0"/>
-          <w:i w:val="0"/>
-        </w:rPr>
-        <w:t xml:space="preserve"> folder, which is synthetic data only and safe to share. It could be on GitHub, public or shared with the organisers.</w:t>
+        <w:t xml:space="preserve"> https://github.com/psraghothamrao8/RAD-SMART (public). It holds the PoC, the documents and the page source. Everything in it is synthetic data only.</w:t>
       </w:r>
     </w:p>
     <w:p>

</xml_diff>

<commit_message>
Add the pitch deck: PDF, web version and slide sources
- docs/deck/src: the 14 slides of the RAD-SMART Pitch Deck artifact
- tools/build_deck.py builds docs/deck/index.html (served by GitHub
  Pages at /deck/) and docs/deck/RAD-SMART_Pitch_Deck.pdf
- docs/figures synced with the latest PoC run; report and kit rebuilt

Co-Authored-By: Claude Opus 5 <noreply@anthropic.com>
</commit_message>
<xml_diff>
--- a/docs/Round1_Submission_Kit.docx
+++ b/docs/Round1_Submission_Kit.docx
@@ -1873,6 +1873,63 @@
           <w:i w:val="0"/>
         </w:rPr>
         <w:t>The link is private to its owner. Share it from the page's Share menu before anyone else, such as Dr Akshay, can open it.</w:t>
+      </w:r>
+    </w:p>
+    <w:p>
+      <w:r>
+        <w:rPr>
+          <w:b w:val="0"/>
+          <w:i w:val="0"/>
+        </w:rPr>
+        <w:t xml:space="preserve">A copy is also on GitHub: the PDF at </w:t>
+      </w:r>
+      <w:r>
+        <w:rPr>
+          <w:rFonts w:ascii="Consolas" w:hAnsi="Consolas"/>
+          <w:b w:val="0"/>
+          <w:i w:val="0"/>
+          <w:sz w:val="18"/>
+        </w:rPr>
+        <w:t>docs/deck/RAD-SMART_Pitch_Deck.pdf</w:t>
+      </w:r>
+      <w:r>
+        <w:rPr>
+          <w:b w:val="0"/>
+          <w:i w:val="0"/>
+        </w:rPr>
+        <w:t xml:space="preserve"> and a public web version at https://psraghothamrao8.github.io/RAD-SMART/deck/. After editing the deck, copy the changed slides into </w:t>
+      </w:r>
+      <w:r>
+        <w:rPr>
+          <w:rFonts w:ascii="Consolas" w:hAnsi="Consolas"/>
+          <w:b w:val="0"/>
+          <w:i w:val="0"/>
+          <w:sz w:val="18"/>
+        </w:rPr>
+        <w:t>docs/deck/src/</w:t>
+      </w:r>
+      <w:r>
+        <w:rPr>
+          <w:b w:val="0"/>
+          <w:i w:val="0"/>
+        </w:rPr>
+        <w:t xml:space="preserve"> and run </w:t>
+      </w:r>
+      <w:r>
+        <w:rPr>
+          <w:rFonts w:ascii="Consolas" w:hAnsi="Consolas"/>
+          <w:b w:val="0"/>
+          <w:i w:val="0"/>
+          <w:sz w:val="18"/>
+        </w:rPr>
+        <w:t>python tools/build_deck.py</w:t>
+      </w:r>
+      <w:r>
+        <w:rPr>
+          <w:b w:val="0"/>
+          <w:i w:val="0"/>
+        </w:rPr>
+        <w:t xml:space="preserve"> to update both.</w:t>
       </w:r>
     </w:p>
     <w:p>

</xml_diff>

<commit_message>
Build in the department's answers and update every deliverable
The PoC now follows the rules Dr Akshay confirmed on 21 Sep 2026:
08:30-01:00 day, one breast board and one ABC with linac reservations,
MHRC slots and the 17:00 bus, public transport home by 21:00, urgent
starts by 18:00, reporting 20/45 min early with bladder filling for
pelvic patients, imaging holds, TBI, and both downtime rules.

- Re-planning costs the waiting of patients already in the department,
  so nobody already waiting is pushed hours later after a fault
- Independent rule checker; buffer trade-off for urgent holds
- Results page, report (Appendix B answered), kit, READMEs and deck
  rebuilt from the new run

Co-Authored-By: Claude Opus 5 <noreply@anthropic.com>
</commit_message>
<xml_diff>
--- a/docs/Round1_Submission_Kit.docx
+++ b/docs/Round1_Submission_Kit.docx
@@ -509,7 +509,7 @@
                 <w:i w:val="0"/>
                 <w:sz w:val="18"/>
               </w:rPr>
-              <w:t>Dr Akshay reviews the answers below and the open questions in the report (Appendix B)</w:t>
+              <w:t>Dr Akshay reviews the answers below, and the report's Appendix B, which now records the department's answers of 21 Sep and the few items still open</w:t>
             </w:r>
           </w:p>
         </w:tc>
@@ -1217,7 +1217,237 @@
           <w:b w:val="0"/>
           <w:i w:val="0"/>
         </w:rPr>
-        <w:t>A radiotherapy machine treats 70–90 patients a day, and most of them come every weekday for 1–7 weeks. In our department, radiation therapy technologists give out appointment times by hand, without knowing how many machine-minutes each patient needs. Too many patients are told to come at the same time and other hours sit under-used, so patients wait long and unpredictably every day of their course, often with a family member who has taken the day off. The department must also fit new starts before 5 PM, complex procedures (SBRT, SRT, TBI, CSI) while senior staff are present, a fixed blood-irradiation slot, breast boards and ABC devices shared with the CT simulator, same-day urgent palliative patients, machine faults, and soon a second machine with different capabilities (Versa HD and Halcyon). Deciding how many new patients to start each day is also subjective today.</w:t>
+        <w:t>A radiotherapy machine treats 70–90 patients a day, and most of them come every weekday for 1–7 weeks. Our Versa HD runs from 08:30 until about 01:00 in three RTT shifts, with a ceiling of 90 patients a day. Radiation therapy technologists give out appointment times by hand, without knowing how many machine-minutes each patient needs. Too many patients are told to come at the same time and other hours sit under-used, so patients wait long and unpredictably every day of their course, often with a family member who has taken the day off. The department must also:</w:t>
+      </w:r>
+    </w:p>
+    <w:p>
+      <w:pPr>
+        <w:tabs>
+          <w:tab w:pos="340" w:val="left"/>
+        </w:tabs>
+        <w:spacing w:after="40"/>
+        <w:ind w:left="340" w:hanging="255"/>
+      </w:pPr>
+      <w:r>
+        <w:rPr>
+          <w:color w:val="1C5CAB"/>
+        </w:rPr>
+        <w:t>•</w:t>
+        <w:tab/>
+      </w:r>
+      <w:r>
+        <w:rPr>
+          <w:b w:val="0"/>
+          <w:i w:val="0"/>
+        </w:rPr>
+        <w:t>finish new starts by 17:00;</w:t>
+      </w:r>
+    </w:p>
+    <w:p>
+      <w:pPr>
+        <w:tabs>
+          <w:tab w:pos="340" w:val="left"/>
+        </w:tabs>
+        <w:spacing w:after="40"/>
+        <w:ind w:left="340" w:hanging="255"/>
+      </w:pPr>
+      <w:r>
+        <w:rPr>
+          <w:color w:val="1C5CAB"/>
+        </w:rPr>
+        <w:t>•</w:t>
+        <w:tab/>
+      </w:r>
+      <w:r>
+        <w:rPr>
+          <w:b w:val="0"/>
+          <w:i w:val="0"/>
+        </w:rPr>
+        <w:t>keep complex procedures (SBRT, SRT, TBI, CSI) inside 10:00–17:00, while senior staff are present;</w:t>
+      </w:r>
+    </w:p>
+    <w:p>
+      <w:pPr>
+        <w:tabs>
+          <w:tab w:pos="340" w:val="left"/>
+        </w:tabs>
+        <w:spacing w:after="40"/>
+        <w:ind w:left="340" w:hanging="255"/>
+      </w:pPr>
+      <w:r>
+        <w:rPr>
+          <w:color w:val="1C5CAB"/>
+        </w:rPr>
+        <w:t>•</w:t>
+        <w:tab/>
+      </w:r>
+      <w:r>
+        <w:rPr>
+          <w:b w:val="0"/>
+          <w:i w:val="0"/>
+        </w:rPr>
+        <w:t>keep 13:30–14:00 for blood irradiation;</w:t>
+      </w:r>
+    </w:p>
+    <w:p>
+      <w:pPr>
+        <w:tabs>
+          <w:tab w:pos="340" w:val="left"/>
+        </w:tabs>
+        <w:spacing w:after="40"/>
+        <w:ind w:left="340" w:hanging="255"/>
+      </w:pPr>
+      <w:r>
+        <w:rPr>
+          <w:color w:val="1C5CAB"/>
+        </w:rPr>
+        <w:t>•</w:t>
+        <w:tab/>
+      </w:r>
+      <w:r>
+        <w:rPr>
+          <w:b w:val="0"/>
+          <w:i w:val="0"/>
+        </w:rPr>
+        <w:t>share one breast board and one ABC unit with the CT simulator;</w:t>
+      </w:r>
+    </w:p>
+    <w:p>
+      <w:pPr>
+        <w:tabs>
+          <w:tab w:pos="340" w:val="left"/>
+        </w:tabs>
+        <w:spacing w:after="40"/>
+        <w:ind w:left="340" w:hanging="255"/>
+      </w:pPr>
+      <w:r>
+        <w:rPr>
+          <w:color w:val="1C5CAB"/>
+        </w:rPr>
+        <w:t>•</w:t>
+        <w:tab/>
+      </w:r>
+      <w:r>
+        <w:rPr>
+          <w:b w:val="0"/>
+          <w:i w:val="0"/>
+        </w:rPr>
+        <w:t>treat MHRC patients in time for the 17:00 hospital bus;</w:t>
+      </w:r>
+    </w:p>
+    <w:p>
+      <w:pPr>
+        <w:tabs>
+          <w:tab w:pos="340" w:val="left"/>
+        </w:tabs>
+        <w:spacing w:after="40"/>
+        <w:ind w:left="340" w:hanging="255"/>
+      </w:pPr>
+      <w:r>
+        <w:rPr>
+          <w:color w:val="1C5CAB"/>
+        </w:rPr>
+        <w:t>•</w:t>
+        <w:tab/>
+      </w:r>
+      <w:r>
+        <w:rPr>
+          <w:b w:val="0"/>
+          <w:i w:val="0"/>
+        </w:rPr>
+        <w:t>get public-transport patients home by 21:00;</w:t>
+      </w:r>
+    </w:p>
+    <w:p>
+      <w:pPr>
+        <w:tabs>
+          <w:tab w:pos="340" w:val="left"/>
+        </w:tabs>
+        <w:spacing w:after="40"/>
+        <w:ind w:left="340" w:hanging="255"/>
+      </w:pPr>
+      <w:r>
+        <w:rPr>
+          <w:color w:val="1C5CAB"/>
+        </w:rPr>
+        <w:t>•</w:t>
+        <w:tab/>
+      </w:r>
+      <w:r>
+        <w:rPr>
+          <w:b w:val="0"/>
+          <w:i w:val="0"/>
+        </w:rPr>
+        <w:t>treat same-day urgent patients before 18:00;</w:t>
+      </w:r>
+    </w:p>
+    <w:p>
+      <w:pPr>
+        <w:tabs>
+          <w:tab w:pos="340" w:val="left"/>
+        </w:tabs>
+        <w:spacing w:after="40"/>
+        <w:ind w:left="340" w:hanging="255"/>
+      </w:pPr>
+      <w:r>
+        <w:rPr>
+          <w:color w:val="1C5CAB"/>
+        </w:rPr>
+        <w:t>•</w:t>
+        <w:tab/>
+      </w:r>
+      <w:r>
+        <w:rPr>
+          <w:b w:val="0"/>
+          <w:i w:val="0"/>
+        </w:rPr>
+        <w:t>run TBI courses;</w:t>
+      </w:r>
+    </w:p>
+    <w:p>
+      <w:pPr>
+        <w:tabs>
+          <w:tab w:pos="340" w:val="left"/>
+        </w:tabs>
+        <w:spacing w:after="40"/>
+        <w:ind w:left="340" w:hanging="255"/>
+      </w:pPr>
+      <w:r>
+        <w:rPr>
+          <w:color w:val="1C5CAB"/>
+        </w:rPr>
+        <w:t>•</w:t>
+        <w:tab/>
+      </w:r>
+      <w:r>
+        <w:rPr>
+          <w:b w:val="0"/>
+          <w:i w:val="0"/>
+        </w:rPr>
+        <w:t>recover from machine faults;</w:t>
+      </w:r>
+    </w:p>
+    <w:p>
+      <w:pPr>
+        <w:tabs>
+          <w:tab w:pos="340" w:val="left"/>
+        </w:tabs>
+        <w:spacing w:after="40"/>
+        <w:ind w:left="340" w:hanging="255"/>
+      </w:pPr>
+      <w:r>
+        <w:rPr>
+          <w:color w:val="1C5CAB"/>
+        </w:rPr>
+        <w:t>•</w:t>
+        <w:tab/>
+      </w:r>
+      <w:r>
+        <w:rPr>
+          <w:b w:val="0"/>
+          <w:i w:val="0"/>
+        </w:rPr>
+        <w:t>prepare for a second machine arriving in early 2027.</w:t>
       </w:r>
     </w:p>
     <w:p>
@@ -1226,7 +1456,16 @@
           <w:b w:val="0"/>
           <w:i w:val="0"/>
         </w:rPr>
-        <w:t>If we solve it, patients arrive close to their real treatment time and are told about delays before they leave home. RTTs stop juggling times by hand. Complex cases always get supervision. New starts are planned two days ahead from real machine load, and both machines are used evenly. On a synthetic 67-patient day simulated 300 times, our prototype cut the median wait from arrival to treatment from 71 to 19 minutes and the 90th-percentile wait from 227 to 52 minutes, with no extra overtime and no broken rules. The pilot target is at least a 40% lower median wait within 90 days.</w:t>
+        <w:t>Deciding how many new patients to start each day is also subjective today, and no workflow timestamps are recorded.</w:t>
+      </w:r>
+    </w:p>
+    <w:p>
+      <w:r>
+        <w:rPr>
+          <w:b w:val="0"/>
+          <w:i w:val="0"/>
+        </w:rPr>
+        <w:t>If we solve it, patients arrive close to their real treatment time and are told about delays before they leave home. RTTs stop juggling times by hand. Complex cases always get supervision. New starts are planned two days ahead from real machine load, and both machines are used evenly. Our prototype was tested under the department's own rules on a synthetic 87-patient day, simulated 300 times. It cut the median wait from arrival to treatment from 100 to 33 minutes, and the 90th-percentile wait from 173 to 62 minutes, including the 20- or 45-minute preparation time. Every hard rule held. The pilot target is at least a 40% lower median wait within 90 days.</w:t>
       </w:r>
     </w:p>
     <w:p>
@@ -1244,7 +1483,7 @@
           <w:b w:val="0"/>
           <w:i w:val="0"/>
         </w:rPr>
-        <w:t>Radiotherapy patients come daily for weeks, yet times are allocated by hand, without knowing each patient's machine-minutes. Patients wait long and unpredictably while staff juggle new starts before 5 PM, supervised complex cases, a blood-irradiation slot, shared accessories, urgent patients and machine faults. Solving it gives patients predictable times, staff a plan they can trust, and the department balanced machines. Our prototype cut the median wait from 71 to 19 minutes on synthetic data. The pilot target is at least 40% lower in 90 days.</w:t>
+        <w:t>Radiotherapy patients come daily for weeks, yet times are allocated by hand, without knowing each patient's machine-minutes. Patients wait long and unpredictably while staff juggle new starts by 17:00, supervised complex cases, the blood-irradiation slot, one breast board and one ABC unit shared with the CT simulator, the 17:00 MHRC bus, public-transport patients who must be home by 21:00, urgent patients, TBI and machine faults. Solving it gives patients predictable times, staff a plan they can trust, and the department balanced machines. Under the department's own rules, our prototype cut the median wait from 100 to 33 minutes on synthetic data. The pilot target is at least 40% lower in 90 days.</w:t>
       </w:r>
     </w:p>
     <w:p>
@@ -1305,7 +1544,7 @@
           <w:b w:val="0"/>
           <w:i w:val="0"/>
         </w:rPr>
-        <w:t xml:space="preserve"> A quantile gradient-boosting model predicts each session's machine-minutes (typical P50 and cautious P80) from operational tags: technique, fraction number, imaging, mobility and accessories. It starts from the department's average tables and learns from daily timestamps.</w:t>
+        <w:t xml:space="preserve"> A gradient-boosting model predicts each session's machine-minutes (expected and cautious P80) from operational tags: technique, fraction number, imaging, mobility and accessories. The department has no timestamps yet, so it starts from the department's own estimate table and learns once check-in and room timestamps are captured.</w:t>
       </w:r>
     </w:p>
     <w:p>
@@ -1335,7 +1574,7 @@
           <w:b w:val="0"/>
           <w:i w:val="0"/>
         </w:rPr>
-        <w:t xml:space="preserve"> A constraint-optimisation engine (OR-Tools CP-SAT; HiGHS MILP in our prototype) builds the evening-before plan for each machine. Hard rules cannot be broken: new starts before 5 PM, complex cases in the senior-staff window, the blood slot, accessory limits including CT-simulator bookings. When a delay, fault, no-show or urgent patient occurs, it re-plans the rest of the day in seconds while moving as few patients as possible.</w:t>
+        <w:t xml:space="preserve"> A constraint-optimisation engine (OR-Tools CP-SAT; HiGHS MILP in our prototype) builds the evening-before plan for each machine. Hard rules cannot be broken, and an independent checker re-verifies them. They include new starts by 17:00, complex cases in 10:00–17:00, the blood slot, MHRC slots before the 17:00 bus, public transport home by 21:00, and accessory limits including CT-simulator bookings and reservations. When a delay, fault, no-show, imaging hold or urgent patient occurs, it re-plans the rest of the day in seconds under the department's downtime rules. It treats patients already waiting first and moves as few others as possible.</w:t>
       </w:r>
     </w:p>
     <w:p>
@@ -1365,7 +1604,7 @@
           <w:b w:val="0"/>
           <w:i w:val="0"/>
         </w:rPr>
-        <w:t xml:space="preserve"> A digital twin stress-tests every plan against late arrivals, overruns and faults. It also produces a three-week load forecast and two-day-ahead advice on how many new patients each machine can take, balanced by minutes rather than head-count.</w:t>
+        <w:t xml:space="preserve"> A digital twin stress-tests every plan against late arrivals, overruns and faults. It also produces a three-week load forecast that plans around TBI courses, and two-day-ahead advice on how many new patients each machine can take, balanced by minutes rather than head-count.</w:t>
       </w:r>
     </w:p>
     <w:p>
@@ -1395,7 +1634,7 @@
           <w:b w:val="0"/>
           <w:i w:val="0"/>
         </w:rPr>
-        <w:t xml:space="preserve"> A copilot on Sarvam AI (Sarvam-105B with tool calling via LangGraph) explains every placement ("why was this patient moved?") and turns rule changes written in plain language into versioned, validated configuration. Bulbul, Saaras and Sarvam Translate send patients and caregivers their time and live updates by WhatsApp, SMS or voice call in their own language, and understand spoken "I'm running late" replies. The LLM never makes a scheduling decision.</w:t>
+        <w:t xml:space="preserve"> A copilot on Sarvam AI (Sarvam-105B with tool calling via LangGraph) explains every placement ("why was this patient moved?") and turns rule changes written in plain language into versioned, validated configuration. Bulbul, Saaras and Sarvam Translate send patients and caregivers their reporting time and live updates by WhatsApp, SMS or voice call in Kannada, Malayalam, Hindi or English, and understand spoken "I'm running late" replies. Tulu, which no Sarvam model covers yet, gets Kannada-script text with a voice note recorded by Tulu-speaking staff. The LLM never makes a scheduling decision.</w:t>
       </w:r>
     </w:p>
     <w:p>
@@ -1422,7 +1661,7 @@
           <w:b w:val="0"/>
           <w:i w:val="0"/>
         </w:rPr>
-        <w:t>An assistive scheduling layer with four parts. Machine learning predicts each session's machine-minutes. A constraint optimiser (OR-Tools / HiGHS) builds and live-repairs the plan with hard rules guaranteed. A digital twin tests plans and forecasts new-start capacity two days ahead. A Sarvam AI copilot explains decisions, edits rules from plain language and messages patients by WhatsApp, SMS or voice in their language. RTTs approve every change. It works from Excel, paper (OCR) and QR check-in, on an on-premise server.</w:t>
+        <w:t>An assistive scheduling layer with four parts. Machine learning predicts each session's machine-minutes. A constraint optimiser (OR-Tools / HiGHS) builds and live-repairs the plan with hard rules guaranteed. A digital twin tests plans and forecasts new-start capacity two days ahead. A Sarvam AI copilot explains decisions, edits rules from plain language and messages patients by WhatsApp, SMS or voice in their language, with recorded voice notes for Tulu. A senior RTT or oncologist approves every change. It works from Excel, paper (OCR) and QR check-in, on an on-premise server.</w:t>
       </w:r>
     </w:p>
     <w:p>
@@ -1474,7 +1713,7 @@
           <w:b w:val="0"/>
           <w:i w:val="0"/>
         </w:rPr>
-        <w:t xml:space="preserve"> Dr Akshay Dinesan (Manipal) wrote the problem statement from daily experience in a working radiotherapy department that runs a Versa HD and is adding a Halcyon. Dr Akshay can validate every rule and has a path to a real pilot and the RTT team who will use it.</w:t>
+        <w:t xml:space="preserve"> Dr Akshay Dinesan (Manipal) wrote the problem statement from daily experience in a working radiotherapy department that runs a Versa HD and is adding a second machine in early 2027. The department has already answered our detailed questions on its rules, from the MHRC bus to accessory reservations and downtime, and they are built into the prototype. Dr Akshay has a path to a real pilot and the RTT team who will use it.</w:t>
       </w:r>
     </w:p>
     <w:p>
@@ -1504,7 +1743,7 @@
           <w:b w:val="0"/>
           <w:i w:val="0"/>
         </w:rPr>
-        <w:t xml:space="preserve"> In the Round 1 window we built a working prototype. It generates realistic synthetic departments, predicts session durations, solves a 67-patient day to a proven optimum in 2–8 seconds, re-plans a machine fault in about 4 seconds, and forecasts new-start capacity for two machines. We tested it over 300 simulated days against a model of current practice.</w:t>
+        <w:t xml:space="preserve"> In the Round 1 window we built a working prototype. It generates realistic synthetic departments under the department's own rules. It predicts session durations and solves an 87-patient day to a proven optimum in about 20 seconds. It re-plans machine faults in 4–26 seconds under the department's downtime rules, and forecasts new-start capacity for two machines around a TBI course. We tested it over 300 simulated days against a model of current practice.</w:t>
       </w:r>
     </w:p>
     <w:p>
@@ -1582,7 +1821,7 @@
           <w:b w:val="0"/>
           <w:i w:val="0"/>
         </w:rPr>
-        <w:t>Dr Akshay Dinesan owns the problem in a working radiotherapy department (Versa HD, adding Halcyon) and can take it to a real pilot. The tech team [names] covers optimisation, machine learning, Indian-language AI and full-stack development. It has already built a working prototype that plans a 67-patient day with guaranteed rules, re-plans a machine fault in about 4 seconds, and was tested over 300 simulated days.</w:t>
+        <w:t>Dr Akshay Dinesan owns the problem in a working radiotherapy department (a Versa HD, with a second machine arriving in early 2027), has given us the department's rules, and can take it to a real pilot. The tech team [names] covers optimisation, machine learning, Indian-language AI and full-stack development. It has already built a working prototype that plans an 87-patient day under the department's rules, re-plans machine faults in seconds, and was tested over 300 simulated days.</w:t>
       </w:r>
     </w:p>
     <w:p>
@@ -1643,7 +1882,7 @@
           <w:b w:val="0"/>
           <w:i w:val="0"/>
         </w:rPr>
-        <w:t xml:space="preserve"> (for example MOSAIQ and ARIA) hold appointment calendars and record treatment times. As far as we know, they do not build a minute-level plan from predicted durations with guaranteed operational rules, re-plan live, balance a mixed-vendor fleet, or message patients in Indian languages. A department with an Elekta Versa HD and a Varian Halcyon needs a vendor-neutral layer.</w:t>
+        <w:t xml:space="preserve"> (for example MOSAIQ and ARIA) hold appointment calendars and record treatment times. As far as we know, they do not build a minute-level plan from predicted durations with guaranteed operational rules, re-plan live, balance a mixed-vendor fleet, or message patients in Indian languages. A department adding a second machine, possibly from another vendor, needs a vendor-neutral layer.</w:t>
       </w:r>
     </w:p>
     <w:p>
@@ -1988,7 +2227,7 @@
           <w:b w:val="0"/>
           <w:i w:val="0"/>
         </w:rPr>
-        <w:t>, the full research report and implementation plan (27 pages).</w:t>
+        <w:t>, the full research report and implementation plan (36 pages).</w:t>
       </w:r>
     </w:p>
     <w:p>
@@ -2018,7 +2257,7 @@
           <w:b w:val="0"/>
           <w:i w:val="0"/>
         </w:rPr>
-        <w:t xml:space="preserve"> the interactive results page at https://psraghothamrao8.github.io/RAD-SMART/, hosted on GitHub Pages and open to anyone. It shows the wait curves, the optimised day with a reason for every session, the fault re-plan and the two-machine forecast, all from the PoC on synthetic data. After re-running the PoC, run </w:t>
+        <w:t xml:space="preserve"> the interactive results page at https://psraghothamrao8.github.io/RAD-SMART/, hosted on GitHub Pages and open to anyone. It shows the wait curves, the optimised day with a reason for every session, the trade-off of holding capacity for urgent starts, both downtime re-plans and the two-machine forecast with TBI, all from the PoC on synthetic data. After re-running the PoC, run </w:t>
       </w:r>
       <w:r>
         <w:rPr>
@@ -2172,7 +2411,7 @@
       <w:tr>
         <w:tc>
           <w:tcPr>
-            <w:tcW w:type="dxa" w:w="519"/>
+            <w:tcW w:type="dxa" w:w="490"/>
             <w:shd w:val="clear" w:color="auto" w:fill="E8EFF9"/>
           </w:tcPr>
           <w:p>
@@ -2191,7 +2430,7 @@
         </w:tc>
         <w:tc>
           <w:tcPr>
-            <w:tcW w:type="dxa" w:w="2696"/>
+            <w:tcW w:type="dxa" w:w="3091"/>
             <w:shd w:val="clear" w:color="auto" w:fill="E8EFF9"/>
           </w:tcPr>
           <w:p>
@@ -2210,7 +2449,7 @@
         </w:tc>
         <w:tc>
           <w:tcPr>
-            <w:tcW w:type="dxa" w:w="3277"/>
+            <w:tcW w:type="dxa" w:w="3091"/>
             <w:shd w:val="clear" w:color="auto" w:fill="E8EFF9"/>
           </w:tcPr>
           <w:p>
@@ -2229,7 +2468,7 @@
         </w:tc>
         <w:tc>
           <w:tcPr>
-            <w:tcW w:type="dxa" w:w="3145"/>
+            <w:tcW w:type="dxa" w:w="2966"/>
             <w:shd w:val="clear" w:color="auto" w:fill="E8EFF9"/>
           </w:tcPr>
           <w:p>
@@ -2250,7 +2489,7 @@
       <w:tr>
         <w:tc>
           <w:tcPr>
-            <w:tcW w:type="dxa" w:w="519"/>
+            <w:tcW w:type="dxa" w:w="490"/>
           </w:tcPr>
           <w:p>
             <w:pPr>
@@ -2268,7 +2507,7 @@
         </w:tc>
         <w:tc>
           <w:tcPr>
-            <w:tcW w:type="dxa" w:w="2696"/>
+            <w:tcW w:type="dxa" w:w="3091"/>
           </w:tcPr>
           <w:p>
             <w:pPr>
@@ -2286,7 +2525,7 @@
         </w:tc>
         <w:tc>
           <w:tcPr>
-            <w:tcW w:type="dxa" w:w="3277"/>
+            <w:tcW w:type="dxa" w:w="3091"/>
           </w:tcPr>
           <w:p>
             <w:pPr>
@@ -2304,7 +2543,7 @@
         </w:tc>
         <w:tc>
           <w:tcPr>
-            <w:tcW w:type="dxa" w:w="3145"/>
+            <w:tcW w:type="dxa" w:w="2966"/>
           </w:tcPr>
           <w:p>
             <w:pPr>
@@ -2324,7 +2563,7 @@
       <w:tr>
         <w:tc>
           <w:tcPr>
-            <w:tcW w:type="dxa" w:w="519"/>
+            <w:tcW w:type="dxa" w:w="490"/>
           </w:tcPr>
           <w:p>
             <w:pPr>
@@ -2342,7 +2581,7 @@
         </w:tc>
         <w:tc>
           <w:tcPr>
-            <w:tcW w:type="dxa" w:w="2696"/>
+            <w:tcW w:type="dxa" w:w="3091"/>
           </w:tcPr>
           <w:p>
             <w:pPr>
@@ -2360,7 +2599,7 @@
         </w:tc>
         <w:tc>
           <w:tcPr>
-            <w:tcW w:type="dxa" w:w="3277"/>
+            <w:tcW w:type="dxa" w:w="3091"/>
           </w:tcPr>
           <w:p>
             <w:pPr>
@@ -2378,7 +2617,7 @@
         </w:tc>
         <w:tc>
           <w:tcPr>
-            <w:tcW w:type="dxa" w:w="3145"/>
+            <w:tcW w:type="dxa" w:w="2966"/>
           </w:tcPr>
           <w:p>
             <w:pPr>
@@ -2398,7 +2637,7 @@
       <w:tr>
         <w:tc>
           <w:tcPr>
-            <w:tcW w:type="dxa" w:w="519"/>
+            <w:tcW w:type="dxa" w:w="490"/>
           </w:tcPr>
           <w:p>
             <w:pPr>
@@ -2416,7 +2655,7 @@
         </w:tc>
         <w:tc>
           <w:tcPr>
-            <w:tcW w:type="dxa" w:w="2696"/>
+            <w:tcW w:type="dxa" w:w="3091"/>
           </w:tcPr>
           <w:p>
             <w:pPr>
@@ -2434,7 +2673,7 @@
         </w:tc>
         <w:tc>
           <w:tcPr>
-            <w:tcW w:type="dxa" w:w="3277"/>
+            <w:tcW w:type="dxa" w:w="3091"/>
           </w:tcPr>
           <w:p>
             <w:pPr>
@@ -2446,13 +2685,13 @@
                 <w:i w:val="0"/>
                 <w:sz w:val="18"/>
               </w:rPr>
-              <w:t>Hard rules (5 PM new starts, senior-staff window, blood slot, shared accessories) versus soft priorities (elderly, transport, inpatients)</w:t>
+              <w:t>Hard rules (new starts by 17:00, 10:00–17:00 complex window, blood slot, one breast board and one ABC, MHRC bus, public transport by 21:00, urgent by 18:00) versus soft priorities (paying patients' times, older patients, flexible patients in the evening)</w:t>
             </w:r>
           </w:p>
         </w:tc>
         <w:tc>
           <w:tcPr>
-            <w:tcW w:type="dxa" w:w="3145"/>
+            <w:tcW w:type="dxa" w:w="2966"/>
           </w:tcPr>
           <w:p>
             <w:pPr>
@@ -2472,7 +2711,7 @@
       <w:tr>
         <w:tc>
           <w:tcPr>
-            <w:tcW w:type="dxa" w:w="519"/>
+            <w:tcW w:type="dxa" w:w="490"/>
           </w:tcPr>
           <w:p>
             <w:pPr>
@@ -2490,7 +2729,7 @@
         </w:tc>
         <w:tc>
           <w:tcPr>
-            <w:tcW w:type="dxa" w:w="2696"/>
+            <w:tcW w:type="dxa" w:w="3091"/>
           </w:tcPr>
           <w:p>
             <w:pPr>
@@ -2508,7 +2747,7 @@
         </w:tc>
         <w:tc>
           <w:tcPr>
-            <w:tcW w:type="dxa" w:w="3277"/>
+            <w:tcW w:type="dxa" w:w="3091"/>
           </w:tcPr>
           <w:p>
             <w:pPr>
@@ -2526,7 +2765,7 @@
         </w:tc>
         <w:tc>
           <w:tcPr>
-            <w:tcW w:type="dxa" w:w="3145"/>
+            <w:tcW w:type="dxa" w:w="2966"/>
           </w:tcPr>
           <w:p>
             <w:pPr>
@@ -2546,7 +2785,7 @@
       <w:tr>
         <w:tc>
           <w:tcPr>
-            <w:tcW w:type="dxa" w:w="519"/>
+            <w:tcW w:type="dxa" w:w="490"/>
           </w:tcPr>
           <w:p>
             <w:pPr>
@@ -2564,7 +2803,7 @@
         </w:tc>
         <w:tc>
           <w:tcPr>
-            <w:tcW w:type="dxa" w:w="2696"/>
+            <w:tcW w:type="dxa" w:w="3091"/>
           </w:tcPr>
           <w:p>
             <w:pPr>
@@ -2582,7 +2821,7 @@
         </w:tc>
         <w:tc>
           <w:tcPr>
-            <w:tcW w:type="dxa" w:w="3277"/>
+            <w:tcW w:type="dxa" w:w="3091"/>
           </w:tcPr>
           <w:p>
             <w:pPr>
@@ -2600,7 +2839,7 @@
         </w:tc>
         <w:tc>
           <w:tcPr>
-            <w:tcW w:type="dxa" w:w="3145"/>
+            <w:tcW w:type="dxa" w:w="2966"/>
           </w:tcPr>
           <w:p>
             <w:pPr>
@@ -2620,7 +2859,7 @@
       <w:tr>
         <w:tc>
           <w:tcPr>
-            <w:tcW w:type="dxa" w:w="519"/>
+            <w:tcW w:type="dxa" w:w="490"/>
           </w:tcPr>
           <w:p>
             <w:pPr>
@@ -2638,7 +2877,7 @@
         </w:tc>
         <w:tc>
           <w:tcPr>
-            <w:tcW w:type="dxa" w:w="2696"/>
+            <w:tcW w:type="dxa" w:w="3091"/>
           </w:tcPr>
           <w:p>
             <w:pPr>
@@ -2656,7 +2895,7 @@
         </w:tc>
         <w:tc>
           <w:tcPr>
-            <w:tcW w:type="dxa" w:w="3277"/>
+            <w:tcW w:type="dxa" w:w="3091"/>
           </w:tcPr>
           <w:p>
             <w:pPr>
@@ -2674,7 +2913,7 @@
         </w:tc>
         <w:tc>
           <w:tcPr>
-            <w:tcW w:type="dxa" w:w="3145"/>
+            <w:tcW w:type="dxa" w:w="2966"/>
           </w:tcPr>
           <w:p>
             <w:pPr>
@@ -2694,7 +2933,7 @@
       <w:tr>
         <w:tc>
           <w:tcPr>
-            <w:tcW w:type="dxa" w:w="519"/>
+            <w:tcW w:type="dxa" w:w="490"/>
           </w:tcPr>
           <w:p>
             <w:pPr>
@@ -2712,7 +2951,7 @@
         </w:tc>
         <w:tc>
           <w:tcPr>
-            <w:tcW w:type="dxa" w:w="2696"/>
+            <w:tcW w:type="dxa" w:w="3091"/>
           </w:tcPr>
           <w:p>
             <w:pPr>
@@ -2730,7 +2969,7 @@
         </w:tc>
         <w:tc>
           <w:tcPr>
-            <w:tcW w:type="dxa" w:w="3277"/>
+            <w:tcW w:type="dxa" w:w="3091"/>
           </w:tcPr>
           <w:p>
             <w:pPr>
@@ -2742,13 +2981,13 @@
                 <w:i w:val="0"/>
                 <w:sz w:val="18"/>
               </w:rPr>
-              <w:t>ML for minutes; the optimiser guarantees rules; the twin tests; the Sarvam copilot explains and speaks 10+ languages</w:t>
+              <w:t>ML for minutes; the optimiser guarantees rules; the twin tests; the Sarvam copilot explains and speaks Kannada, Malayalam, Hindi and English, with recorded Tulu voice notes</w:t>
             </w:r>
           </w:p>
         </w:tc>
         <w:tc>
           <w:tcPr>
-            <w:tcW w:type="dxa" w:w="3145"/>
+            <w:tcW w:type="dxa" w:w="2966"/>
           </w:tcPr>
           <w:p>
             <w:pPr>
@@ -2768,7 +3007,7 @@
       <w:tr>
         <w:tc>
           <w:tcPr>
-            <w:tcW w:type="dxa" w:w="519"/>
+            <w:tcW w:type="dxa" w:w="490"/>
           </w:tcPr>
           <w:p>
             <w:pPr>
@@ -2786,7 +3025,7 @@
         </w:tc>
         <w:tc>
           <w:tcPr>
-            <w:tcW w:type="dxa" w:w="2696"/>
+            <w:tcW w:type="dxa" w:w="3091"/>
           </w:tcPr>
           <w:p>
             <w:pPr>
@@ -2804,7 +3043,7 @@
         </w:tc>
         <w:tc>
           <w:tcPr>
-            <w:tcW w:type="dxa" w:w="3277"/>
+            <w:tcW w:type="dxa" w:w="3091"/>
           </w:tcPr>
           <w:p>
             <w:pPr>
@@ -2816,13 +3055,13 @@
                 <w:i w:val="0"/>
                 <w:sz w:val="18"/>
               </w:rPr>
-              <w:t>67 patients, proven optimum in seconds, a reason for every placement</w:t>
+              <w:t>87 patients from 08:30 to 00:45, all 7 hard rules re-checked, a reason for every placement</w:t>
             </w:r>
           </w:p>
         </w:tc>
         <w:tc>
           <w:tcPr>
-            <w:tcW w:type="dxa" w:w="3145"/>
+            <w:tcW w:type="dxa" w:w="2966"/>
           </w:tcPr>
           <w:p>
             <w:pPr>
@@ -2851,7 +3090,7 @@
       <w:tr>
         <w:tc>
           <w:tcPr>
-            <w:tcW w:type="dxa" w:w="519"/>
+            <w:tcW w:type="dxa" w:w="490"/>
           </w:tcPr>
           <w:p>
             <w:pPr>
@@ -2869,7 +3108,7 @@
         </w:tc>
         <w:tc>
           <w:tcPr>
-            <w:tcW w:type="dxa" w:w="2696"/>
+            <w:tcW w:type="dxa" w:w="3091"/>
           </w:tcPr>
           <w:p>
             <w:pPr>
@@ -2881,13 +3120,13 @@
                 <w:i w:val="0"/>
                 <w:sz w:val="18"/>
               </w:rPr>
-              <w:t>Waits fall by about three-quarters</w:t>
+              <w:t>Waits fall by two-thirds</w:t>
             </w:r>
           </w:p>
         </w:tc>
         <w:tc>
           <w:tcPr>
-            <w:tcW w:type="dxa" w:w="3277"/>
+            <w:tcW w:type="dxa" w:w="3091"/>
           </w:tcPr>
           <w:p>
             <w:pPr>
@@ -2899,13 +3138,13 @@
                 <w:i w:val="0"/>
                 <w:sz w:val="18"/>
               </w:rPr>
-              <w:t>Median wait 71 → 19 min; 90th percentile 227 → 52 min; within ±15 min 16% → 62%; no extra overtime</w:t>
+              <w:t>Median wait 100 → 33 min; 90th percentile 173 → 62 min; within ±15 min 10% → 73%; the department chooses how much to hold for urgent starts</w:t>
             </w:r>
           </w:p>
         </w:tc>
         <w:tc>
           <w:tcPr>
-            <w:tcW w:type="dxa" w:w="3145"/>
+            <w:tcW w:type="dxa" w:w="2966"/>
           </w:tcPr>
           <w:p>
             <w:pPr>
@@ -2934,7 +3173,7 @@
       <w:tr>
         <w:tc>
           <w:tcPr>
-            <w:tcW w:type="dxa" w:w="519"/>
+            <w:tcW w:type="dxa" w:w="490"/>
           </w:tcPr>
           <w:p>
             <w:pPr>
@@ -2952,7 +3191,7 @@
         </w:tc>
         <w:tc>
           <w:tcPr>
-            <w:tcW w:type="dxa" w:w="2696"/>
+            <w:tcW w:type="dxa" w:w="3091"/>
           </w:tcPr>
           <w:p>
             <w:pPr>
@@ -2964,13 +3203,13 @@
                 <w:i w:val="0"/>
                 <w:sz w:val="18"/>
               </w:rPr>
-              <w:t>It recovers when the machine fails</w:t>
+              <w:t>It recovers when the machine fails, by the department's rules</w:t>
             </w:r>
           </w:p>
         </w:tc>
         <w:tc>
           <w:tcPr>
-            <w:tcW w:type="dxa" w:w="3277"/>
+            <w:tcW w:type="dxa" w:w="3091"/>
           </w:tcPr>
           <w:p>
             <w:pPr>
@@ -2982,13 +3221,13 @@
                 <w:i w:val="0"/>
                 <w:sz w:val="18"/>
               </w:rPr>
-              <w:t>30-min fault: re-planned in 4 s, 17 patients messaged, median wait 93 → 19 min</w:t>
+              <w:t>45-min fault: everyone treated today, median wait 144 → 40 min. 150-min fault: new starts to the next day, median wait 216 → 35 min</w:t>
             </w:r>
           </w:p>
         </w:tc>
         <w:tc>
           <w:tcPr>
-            <w:tcW w:type="dxa" w:w="3145"/>
+            <w:tcW w:type="dxa" w:w="2966"/>
           </w:tcPr>
           <w:p>
             <w:pPr>
@@ -3017,7 +3256,7 @@
       <w:tr>
         <w:tc>
           <w:tcPr>
-            <w:tcW w:type="dxa" w:w="519"/>
+            <w:tcW w:type="dxa" w:w="490"/>
           </w:tcPr>
           <w:p>
             <w:pPr>
@@ -3035,7 +3274,7 @@
         </w:tc>
         <w:tc>
           <w:tcPr>
-            <w:tcW w:type="dxa" w:w="2696"/>
+            <w:tcW w:type="dxa" w:w="3091"/>
           </w:tcPr>
           <w:p>
             <w:pPr>
@@ -3053,7 +3292,7 @@
         </w:tc>
         <w:tc>
           <w:tcPr>
-            <w:tcW w:type="dxa" w:w="3277"/>
+            <w:tcW w:type="dxa" w:w="3091"/>
           </w:tcPr>
           <w:p>
             <w:pPr>
@@ -3065,13 +3304,13 @@
                 <w:i w:val="0"/>
                 <w:sz w:val="18"/>
               </w:rPr>
-              <w:t>Two machines: peak load 156% → 100%</w:t>
+              <w:t>Two machines and a TBI week: peak load 154% → 98%; TBI days fitted exactly</w:t>
             </w:r>
           </w:p>
         </w:tc>
         <w:tc>
           <w:tcPr>
-            <w:tcW w:type="dxa" w:w="3145"/>
+            <w:tcW w:type="dxa" w:w="2966"/>
           </w:tcPr>
           <w:p>
             <w:pPr>
@@ -3100,7 +3339,7 @@
       <w:tr>
         <w:tc>
           <w:tcPr>
-            <w:tcW w:type="dxa" w:w="519"/>
+            <w:tcW w:type="dxa" w:w="490"/>
           </w:tcPr>
           <w:p>
             <w:pPr>
@@ -3118,7 +3357,7 @@
         </w:tc>
         <w:tc>
           <w:tcPr>
-            <w:tcW w:type="dxa" w:w="2696"/>
+            <w:tcW w:type="dxa" w:w="3091"/>
           </w:tcPr>
           <w:p>
             <w:pPr>
@@ -3136,7 +3375,7 @@
         </w:tc>
         <w:tc>
           <w:tcPr>
-            <w:tcW w:type="dxa" w:w="3277"/>
+            <w:tcW w:type="dxa" w:w="3091"/>
           </w:tcPr>
           <w:p>
             <w:pPr>
@@ -3148,13 +3387,13 @@
                 <w:i w:val="0"/>
                 <w:sz w:val="18"/>
               </w:rPr>
-              <w:t>Human approval, one-tap override, audit trail; no clinical inputs; no identifiers to AI; DPDP-aligned; works from Excel, paper and WhatsApp</w:t>
+              <w:t>A senior RTT or oncologist approves every plan; one-tap override, audit trail; no clinical inputs; no identifiers to AI; DPDP-aligned; works from Excel, paper and WhatsApp</w:t>
             </w:r>
           </w:p>
         </w:tc>
         <w:tc>
           <w:tcPr>
-            <w:tcW w:type="dxa" w:w="3145"/>
+            <w:tcW w:type="dxa" w:w="2966"/>
           </w:tcPr>
           <w:p>
             <w:pPr>
@@ -3174,7 +3413,7 @@
       <w:tr>
         <w:tc>
           <w:tcPr>
-            <w:tcW w:type="dxa" w:w="519"/>
+            <w:tcW w:type="dxa" w:w="490"/>
           </w:tcPr>
           <w:p>
             <w:pPr>
@@ -3192,7 +3431,7 @@
         </w:tc>
         <w:tc>
           <w:tcPr>
-            <w:tcW w:type="dxa" w:w="2696"/>
+            <w:tcW w:type="dxa" w:w="3091"/>
           </w:tcPr>
           <w:p>
             <w:pPr>
@@ -3210,7 +3449,7 @@
         </w:tc>
         <w:tc>
           <w:tcPr>
-            <w:tcW w:type="dxa" w:w="3277"/>
+            <w:tcW w:type="dxa" w:w="3091"/>
           </w:tcPr>
           <w:p>
             <w:pPr>
@@ -3228,7 +3467,7 @@
         </w:tc>
         <w:tc>
           <w:tcPr>
-            <w:tcW w:type="dxa" w:w="3145"/>
+            <w:tcW w:type="dxa" w:w="2966"/>
           </w:tcPr>
           <w:p>
             <w:pPr>
@@ -3248,7 +3487,7 @@
       <w:tr>
         <w:tc>
           <w:tcPr>
-            <w:tcW w:type="dxa" w:w="519"/>
+            <w:tcW w:type="dxa" w:w="490"/>
           </w:tcPr>
           <w:p>
             <w:pPr>
@@ -3266,7 +3505,7 @@
         </w:tc>
         <w:tc>
           <w:tcPr>
-            <w:tcW w:type="dxa" w:w="2696"/>
+            <w:tcW w:type="dxa" w:w="3091"/>
           </w:tcPr>
           <w:p>
             <w:pPr>
@@ -3284,7 +3523,7 @@
         </w:tc>
         <w:tc>
           <w:tcPr>
-            <w:tcW w:type="dxa" w:w="3277"/>
+            <w:tcW w:type="dxa" w:w="3091"/>
           </w:tcPr>
           <w:p>
             <w:pPr>
@@ -3302,7 +3541,7 @@
         </w:tc>
         <w:tc>
           <w:tcPr>
-            <w:tcW w:type="dxa" w:w="3145"/>
+            <w:tcW w:type="dxa" w:w="2966"/>
           </w:tcPr>
           <w:p>
             <w:pPr>
@@ -3537,7 +3776,7 @@
                 <w:i w:val="0"/>
                 <w:sz w:val="18"/>
               </w:rPr>
-              <w:t>"It isn't simple booking. New patients must finish before five. Complex treatments need senior staff. There's a blood-irradiation slot, accessories shared with the CT simulator, urgent patients, and machine faults. Soon there'll be a second machine."</w:t>
+              <w:t>"It isn't simple booking. New patients must finish by five. Complex treatments need senior staff. There's a blood-irradiation slot, one breast board and one breathing-control unit shared with the CT simulator, a hospital bus at five, patients who must catch their bus home by nine, urgent patients, and machine faults. Soon there'll be a second machine."</w:t>
             </w:r>
           </w:p>
         </w:tc>
@@ -3649,7 +3888,7 @@
                 <w:i w:val="0"/>
                 <w:sz w:val="18"/>
               </w:rPr>
-              <w:t>"On a synthetic 67-patient day, simulated three hundred times, the median wait fell from seventy-one minutes to nineteen, with no extra overtime, and every new start finished before five."</w:t>
+              <w:t>"On a synthetic eighty-seven-patient day under our department's own rules, simulated three hundred times, the median wait fell from 100 minutes to 33, and every hard rule held."</w:t>
             </w:r>
           </w:p>
         </w:tc>
@@ -3705,7 +3944,7 @@
                 <w:i w:val="0"/>
                 <w:sz w:val="18"/>
               </w:rPr>
-              <w:t>"When the machine fails for thirty minutes, RAD-SMART re-plans the rest of the day in about four seconds. It moves as few people as possible and tells only those who can still act, by WhatsApp, SMS or a voice call."</w:t>
+              <w:t>"When the machine fails, RAD-SMART re-plans the rest of the day in seconds, following our department's downtime rules. Patients already waiting go first. It moves as few people as possible and tells only those who can still act, by WhatsApp, SMS or a voice call, even in Tulu."</w:t>
             </w:r>
           </w:p>
         </w:tc>
@@ -3761,7 +4000,7 @@
                 <w:i w:val="0"/>
                 <w:sz w:val="18"/>
               </w:rPr>
-              <w:t>"Two days ahead, it advises how many new patients each machine can start, balanced by minutes, not head-count. That keeps both machines at capacity instead of overloading one."</w:t>
+              <w:t>"Two days ahead, it advises how many new patients each machine can start, balanced by minutes, not head-count, and it plans around total body irradiation. That keeps both machines at capacity instead of overloading one."</w:t>
             </w:r>
           </w:p>
         </w:tc>
@@ -3817,7 +4056,7 @@
                 <w:i w:val="0"/>
                 <w:sz w:val="18"/>
               </w:rPr>
-              <w:t>"It is assistive, not diagnostic. It never decides treatment. Technologists approve every plan with one tap, every change is logged, and no personal data goes to the AI models."</w:t>
+              <w:t>"It is assistive, not diagnostic. It never decides treatment. A senior technologist or oncologist approves every plan with one tap, every change is logged, and no personal data goes to the AI models."</w:t>
             </w:r>
           </w:p>
         </w:tc>
@@ -3961,7 +4200,7 @@
           <w:b w:val="0"/>
           <w:i w:val="0"/>
         </w:rPr>
-        <w:t xml:space="preserve"> An LLM cannot guarantee rules such as "no new start after 5 PM", is weak at packing minutes, and can give different answers to the same input. We use the LLM for what it is good at, which is explaining, editing rules and talking to patients in their language. A solver produces the plan.</w:t>
+        <w:t xml:space="preserve"> An LLM cannot guarantee rules such as "no new start after 17:00", is weak at packing minutes, and can give different answers to the same input. We use the LLM for what it is good at, which is explaining, editing rules and talking to patients in their language. A solver produces the plan.</w:t>
       </w:r>
     </w:p>
     <w:p>
@@ -3993,7 +4232,7 @@
           <w:b w:val="0"/>
           <w:i w:val="0"/>
         </w:rPr>
-        <w:t xml:space="preserve"> At first, the department's own average table. The prototype shows that averages alone deliver most of the benefit (71 → 22 minutes). QR check-in and a tablet tap at room entry and exit then collect real durations, and the model learns weekly.</w:t>
+        <w:t xml:space="preserve"> The department records no timestamps today, so we start from its own estimate table. The prototype shows that averages alone deliver most of the benefit (100 → 35 minutes). QR check-in and a tablet tap at room entry and exit then collect real durations, and the model learns weekly.</w:t>
       </w:r>
     </w:p>
     <w:p>
@@ -4009,7 +4248,39 @@
           <w:b w:val="0"/>
           <w:i w:val="0"/>
         </w:rPr>
-        <w:t xml:space="preserve"> Every priority is an explicit, visible weight that the department sets, and transport constraints are hard rules. The dashboard reports waits by group (elderly, transport-dependent, language, paying versus non-paying), and any group getting worse is flagged for review.</w:t>
+        <w:t xml:space="preserve"> The department asked for paying patients to get their preferred time as far as possible. Every priority is an explicit, visible weight that the department sets, and the MHRC bus and public-transport limits are hard rules. The dashboard reports waits by group (elderly, transport-dependent, language, paying versus non-paying), and any group getting worse is flagged for review.</w:t>
+      </w:r>
+    </w:p>
+    <w:p>
+      <w:r>
+        <w:rPr>
+          <w:b/>
+          <w:i w:val="0"/>
+        </w:rPr>
+        <w:t>Your patients speak Tulu. Does Sarvam support it?</w:t>
+      </w:r>
+      <w:r>
+        <w:rPr>
+          <w:b w:val="0"/>
+          <w:i w:val="0"/>
+        </w:rPr>
+        <w:t xml:space="preserve"> Not yet. Sarvam's speech models cover 11 languages (Bulbul v3) and the 22 scheduled languages plus English (Saaras v3), and Tulu is not among them. Tulu speakers get the text in Kannada script, which is how Tulu is usually written, with a short voice note recorded by Tulu-speaking staff for each approved template. If a Tulu model appears, it replaces the recordings.</w:t>
+      </w:r>
+    </w:p>
+    <w:p>
+      <w:r>
+        <w:rPr>
+          <w:b/>
+          <w:i w:val="0"/>
+        </w:rPr>
+        <w:t>Why does the day end later with RAD-SMART?</w:t>
+      </w:r>
+      <w:r>
+        <w:rPr>
+          <w:b w:val="0"/>
+          <w:i w:val="0"/>
+        </w:rPr>
+        <w:t xml:space="preserve"> Because the plan holds 40 minutes for same-day urgent starts and imaging re-treatments. That keeps waits short, but the last patient finishes at 00:53 instead of 00:29. Holding nothing ends the day at 00:17, earlier than today, with a 43-minute median wait. It is one setting, and the department chooses.</w:t>
       </w:r>
     </w:p>
     <w:p>
@@ -4057,7 +4328,7 @@
           <w:b w:val="0"/>
           <w:i w:val="0"/>
         </w:rPr>
-        <w:t xml:space="preserve"> Two weeks of baseline measurement, three weeks of shadow mode, then eight weeks live on one machine. We will report daily median wait as an interrupted time series, alongside balancing measures (throughput, overtime, equity, override rate).</w:t>
+        <w:t xml:space="preserve"> Two weeks of timestamp capture and baseline measurement (the department records none today), three weeks of shadow mode, then eight weeks live on one machine. We will report daily median wait as an interrupted time series, alongside balancing measures (throughput, overtime, equity, override rate).</w:t>
       </w:r>
     </w:p>
     <w:sectPr>

</xml_diff>

<commit_message>
Simplify the deck and website for a non-technical panel, add a research paper, and remove redundant files
- Deck: 9 slides with big numbers and simple bar charts in place of the Gantt and wait curves
- Website: a one-page summary with simple charts and links to every document
- New 8-page research paper (docs/RAD-SMART_Research_Paper.md, .docx, .pdf)
- Removed: the old interactive page sources and builder, duplicate figures in poc/results
  (run_poc.py now writes figures to docs/figures), an unused screenshot, and the
  problem statement PDF (it contains contact details; kept locally, now ignored)

Co-Authored-By: Claude Opus 5.5 <noreply@anthropic.com>
</commit_message>
<xml_diff>
--- a/docs/Round1_Submission_Kit.docx
+++ b/docs/Round1_Submission_Kit.docx
@@ -112,7 +112,23 @@
           <w:b w:val="0"/>
           <w:i w:val="0"/>
         </w:rPr>
-        <w:t>): on the department's own 55 days the 90th-percentile wait falls from 108.6 to 70.4 minutes (−35%), and over 12 synthetic weeks with standing slots from 82 to 49 minutes (−40%). The answers below are as submitted for Round 1, with figures that have since changed updated; the deck now has 10 slides.</w:t>
+        <w:t>): on the department's own 55 days the 90th-percentile wait falls from 108.6 to 70.4 minutes (−35%), and over 12 synthetic weeks with standing slots from 82 to 49 minutes (−40%). The answers below are as submitted for Round 1, with figures that have since changed updated; the deck now has 9 slides, and a short research paper (</w:t>
+      </w:r>
+      <w:r>
+        <w:rPr>
+          <w:rFonts w:ascii="Consolas" w:hAnsi="Consolas"/>
+          <w:b w:val="0"/>
+          <w:i w:val="0"/>
+          <w:sz w:val="18"/>
+        </w:rPr>
+        <w:t>docs/RAD-SMART_Research_Paper.pdf</w:t>
+      </w:r>
+      <w:r>
+        <w:rPr>
+          <w:b w:val="0"/>
+          <w:i w:val="0"/>
+        </w:rPr>
+        <w:t>) sums up the method and results.</w:t>
       </w:r>
     </w:p>
     <w:p>
@@ -121,7 +137,7 @@
           <w:b w:val="0"/>
           <w:i w:val="0"/>
         </w:rPr>
-        <w:t xml:space="preserve">This kit contains ready-to-paste answers for the five Round 1 sections, the outline of our deck, a 3-minute video script, likely jury questions, and a checklist. The deck and an interactive results page are already built and published (sections 2.5 and 2.6). Each answer comes in a </w:t>
+        <w:t xml:space="preserve">This kit contains ready-to-paste answers for the five Round 1 sections, the outline of our deck, a 3-minute video script, likely jury questions, and a checklist. The deck and the project website are already built and published (sections 2.5 and 2.6). Each answer comes in a </w:t>
       </w:r>
       <w:r>
         <w:rPr>
@@ -934,7 +950,7 @@
                 <w:i w:val="0"/>
                 <w:sz w:val="18"/>
               </w:rPr>
-              <w:t>Optional: paste the public results page link as the prototype link, and the code repository link if asked (section 2.6)</w:t>
+              <w:t>Optional: paste the website link as the prototype link, and the code repository link if asked (section 2.6)</w:t>
             </w:r>
           </w:p>
         </w:tc>
@@ -2203,7 +2219,7 @@
           <w:b w:val="0"/>
           <w:i w:val="0"/>
         </w:rPr>
-        <w:t>The deck (now 10 slides) is built and published at https://claude.ai/artifact/LhSJi3g5j23xLHxTRYiSgw (section 3 lists the slides). Before uploading:</w:t>
+        <w:t>The deck (now 9 slides) is built and published at https://claude.ai/artifact/LhSJi3g5j23xLHxTRYiSgw (section 3 lists the slides). Before uploading:</w:t>
       </w:r>
     </w:p>
     <w:p>
@@ -2374,7 +2390,7 @@
           <w:b w:val="0"/>
           <w:i w:val="0"/>
         </w:rPr>
-        <w:t xml:space="preserve">, the full research report and implementation plan (45 pages), and </w:t>
+        <w:t xml:space="preserve">, the full research report and implementation plan (45 pages), </w:t>
       </w:r>
       <w:r>
         <w:rPr>
@@ -2390,7 +2406,23 @@
           <w:b w:val="0"/>
           <w:i w:val="0"/>
         </w:rPr>
-        <w:t>, the four-page analysis with and without RAD-SMART on both datasets.</w:t>
+        <w:t xml:space="preserve">, the four-page analysis with and without RAD-SMART on both datasets, and </w:t>
+      </w:r>
+      <w:r>
+        <w:rPr>
+          <w:rFonts w:ascii="Consolas" w:hAnsi="Consolas"/>
+          <w:b w:val="0"/>
+          <w:i w:val="0"/>
+          <w:sz w:val="18"/>
+        </w:rPr>
+        <w:t>docs/RAD-SMART_Research_Paper.pdf</w:t>
+      </w:r>
+      <w:r>
+        <w:rPr>
+          <w:b w:val="0"/>
+          <w:i w:val="0"/>
+        </w:rPr>
+        <w:t>, the eight-page research paper.</w:t>
       </w:r>
     </w:p>
     <w:p>
@@ -2420,7 +2452,7 @@
           <w:b w:val="0"/>
           <w:i w:val="0"/>
         </w:rPr>
-        <w:t xml:space="preserve"> the interactive results page at https://psraghothamrao8.github.io/RAD-SMART/, hosted on GitHub Pages and open to anyone. It opens with what the department's records show, then gives the PoC's results on synthetic patients: the wait curves against the records, the optimised day with a reason for every session, the trade-off of holding capacity for urgent starts, both downtime re-plans and the two-machine forecast with TBI. After re-running the PoC, run </w:t>
+        <w:t xml:space="preserve"> the project website at https://psraghothamrao8.github.io/RAD-SMART/, hosted on GitHub Pages and open to anyone: a one-page summary with simple charts (the problem, how it works, the app in CARE, results with and without RAD-SMART, breakdowns and the pilot) and links to every document. Its source is </w:t>
       </w:r>
       <w:r>
         <w:rPr>
@@ -2429,14 +2461,14 @@
           <w:i w:val="0"/>
           <w:sz w:val="18"/>
         </w:rPr>
-        <w:t>python tools/build_results_page.py</w:t>
+        <w:t>docs/index.html</w:t>
       </w:r>
       <w:r>
         <w:rPr>
           <w:b w:val="0"/>
           <w:i w:val="0"/>
         </w:rPr>
-        <w:t>, commit and push; the page updates within a few minutes.</w:t>
+        <w:t>; edit it, commit and push, and the page updates within a few minutes.</w:t>
       </w:r>
     </w:p>
     <w:p>
@@ -2532,7 +2564,7 @@
           <w:b w:val="0"/>
           <w:i w:val="0"/>
         </w:rPr>
-        <w:t>3. Deck outline (10 slides)</w:t>
+        <w:t>3. Deck outline (9 slides)</w:t>
       </w:r>
     </w:p>
     <w:p>
@@ -2541,23 +2573,7 @@
           <w:b w:val="0"/>
           <w:i w:val="0"/>
         </w:rPr>
-        <w:t xml:space="preserve">Each slide makes one point with large numbers, uses the figures from </w:t>
-      </w:r>
-      <w:r>
-        <w:rPr>
-          <w:rFonts w:ascii="Consolas" w:hAnsi="Consolas"/>
-          <w:b w:val="0"/>
-          <w:i w:val="0"/>
-          <w:sz w:val="18"/>
-        </w:rPr>
-        <w:t>docs/figures/</w:t>
-      </w:r>
-      <w:r>
-        <w:rPr>
-          <w:b w:val="0"/>
-          <w:i w:val="0"/>
-        </w:rPr>
-        <w:t>, and carries the footer "Assistive, not diagnostic · synthetic patients, anonymised aggregates". The deck has four sections: the problem, the solution, the evidence and the plan.</w:t>
+        <w:t>The deck is written for a panel that is not all technical: one point per slide, large numbers, and simple bar charts drawn on the slide. The footers name the sources. The deck has four sections: the problem, the solution, the evidence and the plan.</w:t>
       </w:r>
     </w:p>
     <w:tbl>
@@ -2590,7 +2606,7 @@
       <w:tr>
         <w:tc>
           <w:tcPr>
-            <w:tcW w:type="dxa" w:w="505"/>
+            <w:tcW w:type="dxa" w:w="559"/>
             <w:shd w:val="clear" w:color="auto" w:fill="E8EFF9"/>
           </w:tcPr>
           <w:p>
@@ -2609,7 +2625,7 @@
         </w:tc>
         <w:tc>
           <w:tcPr>
-            <w:tcW w:type="dxa" w:w="2756"/>
+            <w:tcW w:type="dxa" w:w="2801"/>
             <w:shd w:val="clear" w:color="auto" w:fill="E8EFF9"/>
           </w:tcPr>
           <w:p>
@@ -2628,7 +2644,7 @@
         </w:tc>
         <w:tc>
           <w:tcPr>
-            <w:tcW w:type="dxa" w:w="3188"/>
+            <w:tcW w:type="dxa" w:w="3526"/>
             <w:shd w:val="clear" w:color="auto" w:fill="E8EFF9"/>
           </w:tcPr>
           <w:p>
@@ -2647,7 +2663,7 @@
         </w:tc>
         <w:tc>
           <w:tcPr>
-            <w:tcW w:type="dxa" w:w="3188"/>
+            <w:tcW w:type="dxa" w:w="2751"/>
             <w:shd w:val="clear" w:color="auto" w:fill="E8EFF9"/>
           </w:tcPr>
           <w:p>
@@ -2668,7 +2684,7 @@
       <w:tr>
         <w:tc>
           <w:tcPr>
-            <w:tcW w:type="dxa" w:w="505"/>
+            <w:tcW w:type="dxa" w:w="559"/>
           </w:tcPr>
           <w:p>
             <w:pPr>
@@ -2686,7 +2702,7 @@
         </w:tc>
         <w:tc>
           <w:tcPr>
-            <w:tcW w:type="dxa" w:w="2756"/>
+            <w:tcW w:type="dxa" w:w="2801"/>
           </w:tcPr>
           <w:p>
             <w:pPr>
@@ -2704,7 +2720,7 @@
         </w:tc>
         <w:tc>
           <w:tcPr>
-            <w:tcW w:type="dxa" w:w="3188"/>
+            <w:tcW w:type="dxa" w:w="3526"/>
           </w:tcPr>
           <w:p>
             <w:pPr>
@@ -2722,7 +2738,7 @@
         </w:tc>
         <w:tc>
           <w:tcPr>
-            <w:tcW w:type="dxa" w:w="3188"/>
+            <w:tcW w:type="dxa" w:w="2751"/>
           </w:tcPr>
           <w:p>
             <w:pPr>
@@ -2734,7 +2750,7 @@
                 <w:i w:val="0"/>
                 <w:sz w:val="18"/>
               </w:rPr>
-              <w:t>Title; the five team members and their roles; Cancer track, use case 04</w:t>
+              <w:t>Title; the five team members and their roles</w:t>
             </w:r>
           </w:p>
         </w:tc>
@@ -2742,7 +2758,7 @@
       <w:tr>
         <w:tc>
           <w:tcPr>
-            <w:tcW w:type="dxa" w:w="505"/>
+            <w:tcW w:type="dxa" w:w="559"/>
           </w:tcPr>
           <w:p>
             <w:pPr>
@@ -2760,7 +2776,7 @@
         </w:tc>
         <w:tc>
           <w:tcPr>
-            <w:tcW w:type="dxa" w:w="2756"/>
+            <w:tcW w:type="dxa" w:w="2801"/>
           </w:tcPr>
           <w:p>
             <w:pPr>
@@ -2772,13 +2788,13 @@
                 <w:i w:val="0"/>
                 <w:sz w:val="18"/>
               </w:rPr>
-              <w:t>Every weekday, 70–90 patients wait for one machine</w:t>
+              <w:t>One machine, 70–90 patients a day, long waits</w:t>
             </w:r>
           </w:p>
         </w:tc>
         <w:tc>
           <w:tcPr>
-            <w:tcW w:type="dxa" w:w="3188"/>
+            <w:tcW w:type="dxa" w:w="3526"/>
           </w:tcPr>
           <w:p>
             <w:pPr>
@@ -2790,13 +2806,13 @@
                 <w:i w:val="0"/>
                 <w:sz w:val="18"/>
               </w:rPr>
-              <w:t>The department's records: one patient in ten waits over 109 min, 22% are treated over an hour late, and the median wait grows from 19 min in the morning to 66 min in the evening. India: 69% of centres have one machine</w:t>
+              <w:t>One patient in ten waits over 109 min; 22% are treated over an hour late; the wait grows from 19 min in the morning to 66 in the evening</w:t>
             </w:r>
           </w:p>
         </w:tc>
         <w:tc>
           <w:tcPr>
-            <w:tcW w:type="dxa" w:w="3188"/>
+            <w:tcW w:type="dxa" w:w="2751"/>
           </w:tcPr>
           <w:p>
             <w:pPr>
@@ -2808,7 +2824,7 @@
                 <w:i w:val="0"/>
                 <w:sz w:val="18"/>
               </w:rPr>
-              <w:t>Big numbers from the records</w:t>
+              <w:t>Two big numbers + a two-bar chart</w:t>
             </w:r>
           </w:p>
         </w:tc>
@@ -2816,7 +2832,7 @@
       <w:tr>
         <w:tc>
           <w:tcPr>
-            <w:tcW w:type="dxa" w:w="505"/>
+            <w:tcW w:type="dxa" w:w="559"/>
           </w:tcPr>
           <w:p>
             <w:pPr>
@@ -2834,7 +2850,7 @@
         </w:tc>
         <w:tc>
           <w:tcPr>
-            <w:tcW w:type="dxa" w:w="2756"/>
+            <w:tcW w:type="dxa" w:w="2801"/>
           </w:tcPr>
           <w:p>
             <w:pPr>
@@ -2846,13 +2862,13 @@
                 <w:i w:val="0"/>
                 <w:sz w:val="18"/>
               </w:rPr>
-              <w:t>Allocation under hard rules and soft priorities</w:t>
+              <w:t>It is not just booking appointments</w:t>
             </w:r>
           </w:p>
         </w:tc>
         <w:tc>
           <w:tcPr>
-            <w:tcW w:type="dxa" w:w="3188"/>
+            <w:tcW w:type="dxa" w:w="3526"/>
           </w:tcPr>
           <w:p>
             <w:pPr>
@@ -2864,13 +2880,13 @@
                 <w:i w:val="0"/>
                 <w:sz w:val="18"/>
               </w:rPr>
-              <w:t>Hard rules (new starts by 17:00, 10:00–17:00 complex window, blood slot, one breast board and one ABC, MHRC bus, public transport by 21:00, urgent by 18:00, one standing slot for the course) versus soft priorities (paying patients' times, older patients, flexible patients in the evening)</w:t>
+              <w:t>Sessions differ, rules must hold, the day changes; each patient keeps one slot for the whole course</w:t>
             </w:r>
           </w:p>
         </w:tc>
         <w:tc>
           <w:tcPr>
-            <w:tcW w:type="dxa" w:w="3188"/>
+            <w:tcW w:type="dxa" w:w="2751"/>
           </w:tcPr>
           <w:p>
             <w:pPr>
@@ -2882,7 +2898,7 @@
                 <w:i w:val="0"/>
                 <w:sz w:val="18"/>
               </w:rPr>
-              <w:t>Two rule cards</w:t>
+              <w:t>Three cards</w:t>
             </w:r>
           </w:p>
         </w:tc>
@@ -2890,7 +2906,7 @@
       <w:tr>
         <w:tc>
           <w:tcPr>
-            <w:tcW w:type="dxa" w:w="505"/>
+            <w:tcW w:type="dxa" w:w="559"/>
           </w:tcPr>
           <w:p>
             <w:pPr>
@@ -2908,7 +2924,7 @@
         </w:tc>
         <w:tc>
           <w:tcPr>
-            <w:tcW w:type="dxa" w:w="2756"/>
+            <w:tcW w:type="dxa" w:w="2801"/>
           </w:tcPr>
           <w:p>
             <w:pPr>
@@ -2920,13 +2936,13 @@
                 <w:i w:val="0"/>
                 <w:sz w:val="18"/>
               </w:rPr>
-              <w:t>We compared five ways to build it</w:t>
+              <w:t>We compared five ways; a hybrid scored best</w:t>
             </w:r>
           </w:p>
         </w:tc>
         <w:tc>
           <w:tcPr>
-            <w:tcW w:type="dxa" w:w="3188"/>
+            <w:tcW w:type="dxa" w:w="3526"/>
           </w:tcPr>
           <w:p>
             <w:pPr>
@@ -2938,13 +2954,13 @@
                 <w:i w:val="0"/>
                 <w:sz w:val="18"/>
               </w:rPr>
-              <w:t>Rules, LLM-only, static optimisation, deep RL, hybrid. The hybrid wins at 4.85/5</w:t>
+              <w:t>Templates 3.1, LLM alone 2.6, optimisation alone 3.6, reinforcement learning 2.5, hybrid 4.85 out of 5</w:t>
             </w:r>
           </w:p>
         </w:tc>
         <w:tc>
           <w:tcPr>
-            <w:tcW w:type="dxa" w:w="3188"/>
+            <w:tcW w:type="dxa" w:w="2751"/>
           </w:tcPr>
           <w:p>
             <w:pPr>
@@ -2956,7 +2972,7 @@
                 <w:i w:val="0"/>
                 <w:sz w:val="18"/>
               </w:rPr>
-              <w:t>Decision table</w:t>
+              <w:t>Bar chart of scores</w:t>
             </w:r>
           </w:p>
         </w:tc>
@@ -2964,7 +2980,7 @@
       <w:tr>
         <w:tc>
           <w:tcPr>
-            <w:tcW w:type="dxa" w:w="505"/>
+            <w:tcW w:type="dxa" w:w="559"/>
           </w:tcPr>
           <w:p>
             <w:pPr>
@@ -2982,7 +2998,7 @@
         </w:tc>
         <w:tc>
           <w:tcPr>
-            <w:tcW w:type="dxa" w:w="2756"/>
+            <w:tcW w:type="dxa" w:w="2801"/>
           </w:tcPr>
           <w:p>
             <w:pPr>
@@ -2994,13 +3010,13 @@
                 <w:i w:val="0"/>
                 <w:sz w:val="18"/>
               </w:rPr>
-              <w:t>How RAD-SMART works, and who decides</w:t>
+              <w:t>Four steps, and a person decides</w:t>
             </w:r>
           </w:p>
         </w:tc>
         <w:tc>
           <w:tcPr>
-            <w:tcW w:type="dxa" w:w="3188"/>
+            <w:tcW w:type="dxa" w:w="3526"/>
           </w:tcPr>
           <w:p>
             <w:pPr>
@@ -3012,13 +3028,13 @@
                 <w:i w:val="0"/>
                 <w:sz w:val="18"/>
               </w:rPr>
-              <w:t>Predict, optimise, simulate, explain, each with its PoC result; then the four points in the day where a named person decides, and the light-touch data sources</w:t>
+              <w:t>Predict, plan, test, tell; the doctor approves each course, a technologist or doctor every change on the day</w:t>
             </w:r>
           </w:p>
         </w:tc>
         <w:tc>
           <w:tcPr>
-            <w:tcW w:type="dxa" w:w="3188"/>
+            <w:tcW w:type="dxa" w:w="2751"/>
           </w:tcPr>
           <w:p>
             <w:pPr>
@@ -3030,7 +3046,7 @@
                 <w:i w:val="0"/>
                 <w:sz w:val="18"/>
               </w:rPr>
-              <w:t>Four technique tiles + a human-in-the-loop band</w:t>
+              <w:t>Four step cards + approval band</w:t>
             </w:r>
           </w:p>
         </w:tc>
@@ -3038,7 +3054,7 @@
       <w:tr>
         <w:tc>
           <w:tcPr>
-            <w:tcW w:type="dxa" w:w="505"/>
+            <w:tcW w:type="dxa" w:w="559"/>
           </w:tcPr>
           <w:p>
             <w:pPr>
@@ -3056,7 +3072,7 @@
         </w:tc>
         <w:tc>
           <w:tcPr>
-            <w:tcW w:type="dxa" w:w="2756"/>
+            <w:tcW w:type="dxa" w:w="2801"/>
           </w:tcPr>
           <w:p>
             <w:pPr>
@@ -3068,13 +3084,13 @@
                 <w:i w:val="0"/>
                 <w:sz w:val="18"/>
               </w:rPr>
-              <w:t>From the visit page to the treatment day</w:t>
+              <w:t>One button on the patient's page</w:t>
             </w:r>
           </w:p>
         </w:tc>
         <w:tc>
           <w:tcPr>
-            <w:tcW w:type="dxa" w:w="3188"/>
+            <w:tcW w:type="dxa" w:w="3526"/>
           </w:tcPr>
           <w:p>
             <w:pPr>
@@ -3086,13 +3102,13 @@
                 <w:i w:val="0"/>
                 <w:sz w:val="18"/>
               </w:rPr>
-              <w:t>The application in CARE: the doctor's RADSMART button, intake and approval; the technologist's day board; breakdowns of 15 min to 48 h approved before anyone is told</w:t>
+              <w:t>The working app in CARE: doctor, technologist, breakdown</w:t>
             </w:r>
           </w:p>
         </w:tc>
         <w:tc>
           <w:tcPr>
-            <w:tcW w:type="dxa" w:w="3188"/>
+            <w:tcW w:type="dxa" w:w="2751"/>
           </w:tcPr>
           <w:p>
             <w:pPr>
@@ -3104,7 +3120,7 @@
                 <w:i w:val="0"/>
                 <w:sz w:val="18"/>
               </w:rPr>
-              <w:t>Visit-page button + proposal screenshot</w:t>
+              <w:t>Two screenshots</w:t>
             </w:r>
           </w:p>
         </w:tc>
@@ -3112,7 +3128,7 @@
       <w:tr>
         <w:tc>
           <w:tcPr>
-            <w:tcW w:type="dxa" w:w="505"/>
+            <w:tcW w:type="dxa" w:w="559"/>
           </w:tcPr>
           <w:p>
             <w:pPr>
@@ -3130,7 +3146,7 @@
         </w:tc>
         <w:tc>
           <w:tcPr>
-            <w:tcW w:type="dxa" w:w="2756"/>
+            <w:tcW w:type="dxa" w:w="2801"/>
           </w:tcPr>
           <w:p>
             <w:pPr>
@@ -3142,13 +3158,13 @@
                 <w:i w:val="0"/>
                 <w:sz w:val="18"/>
               </w:rPr>
-              <w:t>One optimised day, with every rule held</w:t>
+              <w:t>Long waits fall by more than a third</w:t>
             </w:r>
           </w:p>
         </w:tc>
         <w:tc>
           <w:tcPr>
-            <w:tcW w:type="dxa" w:w="3188"/>
+            <w:tcW w:type="dxa" w:w="3526"/>
           </w:tcPr>
           <w:p>
             <w:pPr>
@@ -3160,13 +3176,13 @@
                 <w:i w:val="0"/>
                 <w:sz w:val="18"/>
               </w:rPr>
-              <w:t>87 patients from 08:30 to 00:39, all 8 hard rules re-checked, a reason for every placement</w:t>
+              <w:t>Department's 55 days replayed: 109 → 70 min (−35%); 12 simulated weeks: 82 → 49 min (−40%); over an hour late 22% → 6%; the trade-off: a later evening</w:t>
             </w:r>
           </w:p>
         </w:tc>
         <w:tc>
           <w:tcPr>
-            <w:tcW w:type="dxa" w:w="3188"/>
+            <w:tcW w:type="dxa" w:w="2751"/>
           </w:tcPr>
           <w:p>
             <w:pPr>
@@ -3174,20 +3190,11 @@
             </w:pPr>
             <w:r>
               <w:rPr>
-                <w:rFonts w:ascii="Consolas" w:hAnsi="Consolas"/>
                 <w:b w:val="0"/>
                 <w:i w:val="0"/>
                 <w:sz w:val="18"/>
               </w:rPr>
-              <w:t>fig3</w:t>
-            </w:r>
-            <w:r>
-              <w:rPr>
-                <w:b w:val="0"/>
-                <w:i w:val="0"/>
-                <w:sz w:val="18"/>
-              </w:rPr>
-              <w:t xml:space="preserve"> day Gantt</w:t>
+              <w:t>Two before/after bar pairs + three tiles</w:t>
             </w:r>
           </w:p>
         </w:tc>
@@ -3195,7 +3202,7 @@
       <w:tr>
         <w:tc>
           <w:tcPr>
-            <w:tcW w:type="dxa" w:w="505"/>
+            <w:tcW w:type="dxa" w:w="559"/>
           </w:tcPr>
           <w:p>
             <w:pPr>
@@ -3213,7 +3220,7 @@
         </w:tc>
         <w:tc>
           <w:tcPr>
-            <w:tcW w:type="dxa" w:w="2756"/>
+            <w:tcW w:type="dxa" w:w="2801"/>
           </w:tcPr>
           <w:p>
             <w:pPr>
@@ -3225,13 +3232,13 @@
                 <w:i w:val="0"/>
                 <w:sz w:val="18"/>
               </w:rPr>
-              <w:t>Fewer long waits, and times that hold</w:t>
+              <w:t>A new plan in seconds, not a lost day</w:t>
             </w:r>
           </w:p>
         </w:tc>
         <w:tc>
           <w:tcPr>
-            <w:tcW w:type="dxa" w:w="3188"/>
+            <w:tcW w:type="dxa" w:w="3526"/>
           </w:tcPr>
           <w:p>
             <w:pPr>
@@ -3243,13 +3250,13 @@
                 <w:i w:val="0"/>
                 <w:sz w:val="18"/>
               </w:rPr>
-              <w:t>Against the busiest recorded days: 90th-percentile wait 130 → 76 min; over an hour late 27% → 6%; evening median 66 → 36 min; after a 150-min machine fault 104 → 39 min with live re-planning. The median stays about the same, preparation included</w:t>
+              <w:t>Typical wait after a 2½-hour breakdown 104 → 39 min, after 45 minutes 53 → 37; the department's breakdown rules</w:t>
             </w:r>
           </w:p>
         </w:tc>
         <w:tc>
           <w:tcPr>
-            <w:tcW w:type="dxa" w:w="3188"/>
+            <w:tcW w:type="dxa" w:w="2751"/>
           </w:tcPr>
           <w:p>
             <w:pPr>
@@ -3257,20 +3264,11 @@
             </w:pPr>
             <w:r>
               <w:rPr>
-                <w:rFonts w:ascii="Consolas" w:hAnsi="Consolas"/>
                 <w:b w:val="0"/>
                 <w:i w:val="0"/>
                 <w:sz w:val="18"/>
               </w:rPr>
-              <w:t>fig1</w:t>
-            </w:r>
-            <w:r>
-              <w:rPr>
-                <w:b w:val="0"/>
-                <w:i w:val="0"/>
-                <w:sz w:val="18"/>
-              </w:rPr>
-              <w:t xml:space="preserve"> wait curves (records vs simulated) + KPI numbers</w:t>
+              <w:t>Two bar pairs + rules card</w:t>
             </w:r>
           </w:p>
         </w:tc>
@@ -3278,7 +3276,7 @@
       <w:tr>
         <w:tc>
           <w:tcPr>
-            <w:tcW w:type="dxa" w:w="505"/>
+            <w:tcW w:type="dxa" w:w="559"/>
           </w:tcPr>
           <w:p>
             <w:pPr>
@@ -3296,7 +3294,7 @@
         </w:tc>
         <w:tc>
           <w:tcPr>
-            <w:tcW w:type="dxa" w:w="2756"/>
+            <w:tcW w:type="dxa" w:w="2801"/>
           </w:tcPr>
           <w:p>
             <w:pPr>
@@ -3308,13 +3306,13 @@
                 <w:i w:val="0"/>
                 <w:sz w:val="18"/>
               </w:rPr>
-              <w:t>Both datasets: far fewer long waits, at a price</w:t>
+              <w:t>Safe by design, then a 90-day pilot</w:t>
             </w:r>
           </w:p>
         </w:tc>
         <w:tc>
           <w:tcPr>
-            <w:tcW w:type="dxa" w:w="3188"/>
+            <w:tcW w:type="dxa" w:w="3526"/>
           </w:tcPr>
           <w:p>
             <w:pPr>
@@ -3326,51 +3324,13 @@
                 <w:i w:val="0"/>
                 <w:sz w:val="18"/>
               </w:rPr>
-              <w:t>Original (55 recorded days): 108.6 → 70.4 min; simulated (12 weeks, standing slots): 82 → 49 min; the price: a later evening, some new starts a little later, fewer requested times kept</w:t>
+              <w:t>Measure, shadow, live; target 25% shorter long waits; four guardrails; the ask</w:t>
             </w:r>
           </w:p>
         </w:tc>
         <w:tc>
           <w:tcPr>
-            <w:tcW w:type="dxa" w:w="3188"/>
-          </w:tcPr>
-          <w:p>
-            <w:pPr>
-              <w:spacing w:after="0"/>
-            </w:pPr>
-            <w:r>
-              <w:rPr>
-                <w:rFonts w:ascii="Consolas" w:hAnsi="Consolas"/>
-                <w:b w:val="0"/>
-                <w:i w:val="0"/>
-                <w:sz w:val="18"/>
-              </w:rPr>
-              <w:t>fig7</w:t>
-            </w:r>
-            <w:r>
-              <w:rPr>
-                <w:b w:val="0"/>
-                <w:i w:val="0"/>
-                <w:sz w:val="18"/>
-              </w:rPr>
-              <w:t xml:space="preserve"> + </w:t>
-            </w:r>
-            <w:r>
-              <w:rPr>
-                <w:rFonts w:ascii="Consolas" w:hAnsi="Consolas"/>
-                <w:b w:val="0"/>
-                <w:i w:val="0"/>
-                <w:sz w:val="18"/>
-              </w:rPr>
-              <w:t>fig8</w:t>
-            </w:r>
-          </w:p>
-        </w:tc>
-      </w:tr>
-      <w:tr>
-        <w:tc>
-          <w:tcPr>
-            <w:tcW w:type="dxa" w:w="505"/>
+            <w:tcW w:type="dxa" w:w="2751"/>
           </w:tcPr>
           <w:p>
             <w:pPr>
@@ -3382,61 +3342,7 @@
                 <w:i w:val="0"/>
                 <w:sz w:val="18"/>
               </w:rPr>
-              <w:t>10</w:t>
-            </w:r>
-          </w:p>
-        </w:tc>
-        <w:tc>
-          <w:tcPr>
-            <w:tcW w:type="dxa" w:w="2756"/>
-          </w:tcPr>
-          <w:p>
-            <w:pPr>
-              <w:spacing w:after="0"/>
-            </w:pPr>
-            <w:r>
-              <w:rPr>
-                <w:b w:val="0"/>
-                <w:i w:val="0"/>
-                <w:sz w:val="18"/>
-              </w:rPr>
-              <w:t>Safe by design, then 90 days on the Versa HD</w:t>
-            </w:r>
-          </w:p>
-        </w:tc>
-        <w:tc>
-          <w:tcPr>
-            <w:tcW w:type="dxa" w:w="3188"/>
-          </w:tcPr>
-          <w:p>
-            <w:pPr>
-              <w:spacing w:after="0"/>
-            </w:pPr>
-            <w:r>
-              <w:rPr>
-                <w:b w:val="0"/>
-                <w:i w:val="0"/>
-                <w:sz w:val="18"/>
-              </w:rPr>
-              <w:t>Six guardrails (approval, independent rule check, clinicians decide, no identifiers to AI, audit trail, synthetic and anonymised data); baseline 2 weeks, shadow 3 weeks, live 8 weeks; primary KPI: 90th-percentile wait at least 25% lower (records: 109 min); the ask</w:t>
-            </w:r>
-          </w:p>
-        </w:tc>
-        <w:tc>
-          <w:tcPr>
-            <w:tcW w:type="dxa" w:w="3188"/>
-          </w:tcPr>
-          <w:p>
-            <w:pPr>
-              <w:spacing w:after="0"/>
-            </w:pPr>
-            <w:r>
-              <w:rPr>
-                <w:b w:val="0"/>
-                <w:i w:val="0"/>
-                <w:sz w:val="18"/>
-              </w:rPr>
-              <w:t>Guardrail list + pilot timeline and KPI cards</w:t>
+              <w:t>Timeline + two cards</w:t>
             </w:r>
           </w:p>
         </w:tc>
@@ -3453,23 +3359,7 @@
           <w:b w:val="0"/>
           <w:i w:val="0"/>
         </w:rPr>
-        <w:t xml:space="preserve">The earlier 14-slide version, including the separate downtime-recovery and two-machine-forecast slides, is in the repository's git history (commit </w:t>
-      </w:r>
-      <w:r>
-        <w:rPr>
-          <w:rFonts w:ascii="Consolas" w:hAnsi="Consolas"/>
-          <w:b w:val="0"/>
-          <w:i w:val="0"/>
-          <w:sz w:val="18"/>
-        </w:rPr>
-        <w:t>af992f8</w:t>
-      </w:r>
-      <w:r>
-        <w:rPr>
-          <w:b w:val="0"/>
-          <w:i w:val="0"/>
-        </w:rPr>
-        <w:t>) if a longer deck is ever needed.</w:t>
+        <w:t>Earlier, longer versions of the deck (with the day Gantt and the wait curves) are in the repository's git history.</w:t>
       </w:r>
     </w:p>
     <w:p>

</xml_diff>